<commit_message>
Biểu 02: bổ sung phần phạm vi công việc theo mẫu
Co-Authored-By: Claude Opus 5.5 <noreply@anthropic.com>
Claude-Session: https://claude.ai/code/session_013kfHyeUKSX8YviAMfNrZNJ
</commit_message>
<xml_diff>
--- a/3. DỰ THẢO HĐ/Biểu 02 - Phạm vi, cách tính KL, bao hàm đơn giá.docx
+++ b/3. DỰ THẢO HĐ/Biểu 02 - Phạm vi, cách tính KL, bao hàm đơn giá.docx
@@ -151,7 +151,247 @@
           <w:sz w:val="26"/>
           <w:szCs w:val="26"/>
         </w:rPr>
-        <w:t xml:space="preserve">I. Nguyên tắc chung</w:t>
+        <w:t xml:space="preserve">I. Phạm vi công việc</w:t>
+      </w:r>
+    </w:p>
+    <w:p>
+      <w:pPr>
+        <w:spacing w:after="80" w:before="0" w:line="276"/>
+        <w:jc w:val="both"/>
+      </w:pPr>
+      <w:r>
+        <w:rPr>
+          <w:rFonts w:ascii="Times New Roman" w:cs="Times New Roman" w:eastAsia="Times New Roman" w:hAnsi="Times New Roman"/>
+          <w:sz w:val="26"/>
+          <w:szCs w:val="26"/>
+        </w:rPr>
+        <w:t xml:space="preserve">Bên B thực hiện thi công Phần ngầm theo Điều 1.20 Hợp đồng, bao gồm nhưng không giới hạn các công việc sau:</w:t>
+      </w:r>
+    </w:p>
+    <w:p>
+      <w:pPr>
+        <w:spacing w:after="80" w:before="0" w:line="276"/>
+        <w:jc w:val="both"/>
+      </w:pPr>
+      <w:r>
+        <w:rPr>
+          <w:rFonts w:ascii="Times New Roman" w:cs="Times New Roman" w:eastAsia="Times New Roman" w:hAnsi="Times New Roman"/>
+          <w:sz w:val="26"/>
+          <w:szCs w:val="26"/>
+        </w:rPr>
+        <w:t xml:space="preserve">1. Tiếp nhận, quản lý mặt bằng thi công, hố móng do Bên A, Nhà thầu khác bàn giao; tiếp nhận và bảo vệ tim, cốt, mốc giới Công trình trong khi thi công.</w:t>
+      </w:r>
+    </w:p>
+    <w:p>
+      <w:pPr>
+        <w:spacing w:after="80" w:before="0" w:line="276"/>
+        <w:jc w:val="both"/>
+      </w:pPr>
+      <w:r>
+        <w:rPr>
+          <w:rFonts w:ascii="Times New Roman" w:cs="Times New Roman" w:eastAsia="Times New Roman" w:hAnsi="Times New Roman"/>
+          <w:sz w:val="26"/>
+          <w:szCs w:val="26"/>
+        </w:rPr>
+        <w:t xml:space="preserve">2. Chuẩn bị đường công vụ, mặt bằng đứng máy, bãi gia công cốt thép và các hạng mục phụ trợ cần thiết; vận hành cầu rửa xe, hệ thống điện tạm, chiếu sáng và hàng rào do Bên A bàn giao theo Biểu 03.</w:t>
+      </w:r>
+    </w:p>
+    <w:p>
+      <w:pPr>
+        <w:spacing w:after="80" w:before="0" w:line="276"/>
+        <w:jc w:val="both"/>
+      </w:pPr>
+      <w:r>
+        <w:rPr>
+          <w:rFonts w:ascii="Times New Roman" w:cs="Times New Roman" w:eastAsia="Times New Roman" w:hAnsi="Times New Roman"/>
+          <w:sz w:val="26"/>
+          <w:szCs w:val="26"/>
+        </w:rPr>
+        <w:t xml:space="preserve">3. Cung cấp toàn bộ nhân công, máy, thiết bị thi công, vật liệu chính và vật liệu phụ cho thi công hệ cừ, văng chống; kết cấu bê tông cốt thép phần ngầm đến cao độ ±0.00; bể nước sinh hoạt, bể nước PCCC, bể nước xử lý nước thải; móng cẩu tháp; chống thấm phần ngầm theo Hồ sơ thiết kế, Chỉ dẫn kỹ thuật và Hợp đồng.</w:t>
+      </w:r>
+    </w:p>
+    <w:p>
+      <w:pPr>
+        <w:spacing w:after="80" w:before="0" w:line="276"/>
+        <w:jc w:val="both"/>
+      </w:pPr>
+      <w:r>
+        <w:rPr>
+          <w:rFonts w:ascii="Times New Roman" w:cs="Times New Roman" w:eastAsia="Times New Roman" w:hAnsi="Times New Roman"/>
+          <w:sz w:val="26"/>
+          <w:szCs w:val="26"/>
+        </w:rPr>
+        <w:t xml:space="preserve">4. Lập tiến độ thi công chi tiết, biện pháp thi công, danh mục máy móc thiết bị; thuê tư vấn thẩm tra biện pháp thi công hệ cừ, văng chống; lập trình tự đào đất phối hợp với Nhà thầu khác theo Điều 4.2 Hợp đồng.</w:t>
+      </w:r>
+    </w:p>
+    <w:p>
+      <w:pPr>
+        <w:spacing w:after="80" w:before="0" w:line="276"/>
+        <w:jc w:val="both"/>
+      </w:pPr>
+      <w:r>
+        <w:rPr>
+          <w:rFonts w:ascii="Times New Roman" w:cs="Times New Roman" w:eastAsia="Times New Roman" w:hAnsi="Times New Roman"/>
+          <w:sz w:val="26"/>
+          <w:szCs w:val="26"/>
+        </w:rPr>
+        <w:t xml:space="preserve">5. Cung cấp, lắp dựng, duy trì, tháo dỡ hệ cừ, văng chống; vận hành liên tục hệ thống hạ mực nước ngầm, tiêu thoát nước hố móng; kiểm soát, duy trì ổn định hệ chống đỡ tạm trên cơ sở kết quả quan trắc do Bên A cung cấp.</w:t>
+      </w:r>
+    </w:p>
+    <w:p>
+      <w:pPr>
+        <w:spacing w:after="80" w:before="0" w:line="276"/>
+        <w:jc w:val="both"/>
+      </w:pPr>
+      <w:r>
+        <w:rPr>
+          <w:rFonts w:ascii="Times New Roman" w:cs="Times New Roman" w:eastAsia="Times New Roman" w:hAnsi="Times New Roman"/>
+          <w:sz w:val="26"/>
+          <w:szCs w:val="26"/>
+        </w:rPr>
+        <w:t xml:space="preserve">6. Tuyển dụng, đào tạo, tổ chức, quản lý và giám sát lao động trên Công trường; bảo đảm người lao động được hướng dẫn phương pháp làm việc và an toàn lao động, vệ sinh môi trường.</w:t>
+      </w:r>
+    </w:p>
+    <w:p>
+      <w:pPr>
+        <w:spacing w:after="80" w:before="0" w:line="276"/>
+        <w:jc w:val="both"/>
+      </w:pPr>
+      <w:r>
+        <w:rPr>
+          <w:rFonts w:ascii="Times New Roman" w:cs="Times New Roman" w:eastAsia="Times New Roman" w:hAnsi="Times New Roman"/>
+          <w:sz w:val="26"/>
+          <w:szCs w:val="26"/>
+        </w:rPr>
+        <w:t xml:space="preserve">7. Cung cấp, quản lý việc đi lại trong khu vực thi công của Bên B; việc đến và đi từ Công trường một cách an toàn, có trật tự đối với nhân lực của Bên B.</w:t>
+      </w:r>
+    </w:p>
+    <w:p>
+      <w:pPr>
+        <w:spacing w:after="80" w:before="0" w:line="276"/>
+        <w:jc w:val="both"/>
+      </w:pPr>
+      <w:r>
+        <w:rPr>
+          <w:rFonts w:ascii="Times New Roman" w:cs="Times New Roman" w:eastAsia="Times New Roman" w:hAnsi="Times New Roman"/>
+          <w:sz w:val="26"/>
+          <w:szCs w:val="26"/>
+        </w:rPr>
+        <w:t xml:space="preserve">8. Thu xếp vận chuyển, lưu kho, bảo quản vật tư, thiết bị; thủ tục hải quan đối với vật tư, thiết bị nhập khẩu (nếu có).</w:t>
+      </w:r>
+    </w:p>
+    <w:p>
+      <w:pPr>
+        <w:spacing w:after="80" w:before="0" w:line="276"/>
+        <w:jc w:val="both"/>
+      </w:pPr>
+      <w:r>
+        <w:rPr>
+          <w:rFonts w:ascii="Times New Roman" w:cs="Times New Roman" w:eastAsia="Times New Roman" w:hAnsi="Times New Roman"/>
+          <w:sz w:val="26"/>
+          <w:szCs w:val="26"/>
+        </w:rPr>
+        <w:t xml:space="preserve">9. Cung cấp hồ sơ, tài liệu, làm việc với cơ quan, tổ chức liên quan trong phạm vi cho phép để có các giấy phép cần thiết (văn bản chấp thuận, giấy kiểm định, đăng kiểm, đăng ký...) cho thiết bị, nhân lực của Bên B.</w:t>
+      </w:r>
+    </w:p>
+    <w:p>
+      <w:pPr>
+        <w:spacing w:after="80" w:before="0" w:line="276"/>
+        <w:jc w:val="both"/>
+      </w:pPr>
+      <w:r>
+        <w:rPr>
+          <w:rFonts w:ascii="Times New Roman" w:cs="Times New Roman" w:eastAsia="Times New Roman" w:hAnsi="Times New Roman"/>
+          <w:sz w:val="26"/>
+          <w:szCs w:val="26"/>
+        </w:rPr>
+        <w:t xml:space="preserve">10. Thi công đúng Hồ sơ thiết kế, Chỉ dẫn kỹ thuật, quy chuẩn, tiêu chuẩn áp dụng và quy định của cơ quan có thẩm quyền; thí nghiệm vật liệu, thử kín nước chống thấm.</w:t>
+      </w:r>
+    </w:p>
+    <w:p>
+      <w:pPr>
+        <w:spacing w:after="80" w:before="0" w:line="276"/>
+        <w:jc w:val="both"/>
+      </w:pPr>
+      <w:r>
+        <w:rPr>
+          <w:rFonts w:ascii="Times New Roman" w:cs="Times New Roman" w:eastAsia="Times New Roman" w:hAnsi="Times New Roman"/>
+          <w:sz w:val="26"/>
+          <w:szCs w:val="26"/>
+        </w:rPr>
+        <w:t xml:space="preserve">11. Kiểm soát chất lượng công việc; xử lý, khắc phục sai sót, khiếm khuyết về chất lượng trong quá trình thi công và bảo hành.</w:t>
+      </w:r>
+    </w:p>
+    <w:p>
+      <w:pPr>
+        <w:spacing w:after="80" w:before="0" w:line="276"/>
+        <w:jc w:val="both"/>
+      </w:pPr>
+      <w:r>
+        <w:rPr>
+          <w:rFonts w:ascii="Times New Roman" w:cs="Times New Roman" w:eastAsia="Times New Roman" w:hAnsi="Times New Roman"/>
+          <w:sz w:val="26"/>
+          <w:szCs w:val="26"/>
+        </w:rPr>
+        <w:t xml:space="preserve">12. Thực hiện nghiệm thu công việc, nghiệm thu giai đoạn, nghiệm thu hoàn thành; lập hồ sơ chất lượng, hồ sơ hoàn công, hồ sơ thanh toán, quyết toán.</w:t>
+      </w:r>
+    </w:p>
+    <w:p>
+      <w:pPr>
+        <w:spacing w:after="80" w:before="0" w:line="276"/>
+        <w:jc w:val="both"/>
+      </w:pPr>
+      <w:r>
+        <w:rPr>
+          <w:rFonts w:ascii="Times New Roman" w:cs="Times New Roman" w:eastAsia="Times New Roman" w:hAnsi="Times New Roman"/>
+          <w:sz w:val="26"/>
+          <w:szCs w:val="26"/>
+        </w:rPr>
+        <w:t xml:space="preserve">13. Thực hiện các công tác bảo đảm an toàn, bảo vệ môi trường, phòng chống cháy nổ, an ninh trật tự, quan trắc công trình lân cận trong phạm vi Hợp đồng.</w:t>
+      </w:r>
+    </w:p>
+    <w:p>
+      <w:pPr>
+        <w:spacing w:after="80" w:before="0" w:line="276"/>
+        <w:jc w:val="both"/>
+      </w:pPr>
+      <w:r>
+        <w:rPr>
+          <w:rFonts w:ascii="Times New Roman" w:cs="Times New Roman" w:eastAsia="Times New Roman" w:hAnsi="Times New Roman"/>
+          <w:sz w:val="26"/>
+          <w:szCs w:val="26"/>
+        </w:rPr>
+        <w:t xml:space="preserve">14. Hợp tác với Bên A và các Nhà thầu khác trên Công trường; tháo dỡ, nhổ cừ, thu dọn mặt bằng và bàn giao Hạng mục công trình sau khi hoàn thành.</w:t>
+      </w:r>
+    </w:p>
+    <w:p>
+      <w:pPr>
+        <w:spacing w:after="80" w:before="0" w:line="276"/>
+        <w:jc w:val="both"/>
+      </w:pPr>
+      <w:r>
+        <w:rPr>
+          <w:rFonts w:ascii="Times New Roman" w:cs="Times New Roman" w:eastAsia="Times New Roman" w:hAnsi="Times New Roman"/>
+          <w:sz w:val="26"/>
+          <w:szCs w:val="26"/>
+        </w:rPr>
+        <w:t xml:space="preserve">15. Các công việc khác theo Biểu 03 [Ma trận phân chia phạm vi công việc và trách nhiệm] và thỏa thuận của Hợp đồng.</w:t>
+      </w:r>
+    </w:p>
+    <w:p>
+      <w:pPr>
+        <w:spacing w:after="80" w:before="120" w:line="276"/>
+        <w:jc w:val="both"/>
+      </w:pPr>
+      <w:r>
+        <w:rPr>
+          <w:rFonts w:ascii="Times New Roman" w:cs="Times New Roman" w:eastAsia="Times New Roman" w:hAnsi="Times New Roman"/>
+          <w:b/>
+          <w:bCs/>
+          <w:sz w:val="26"/>
+          <w:szCs w:val="26"/>
+        </w:rPr>
+        <w:t xml:space="preserve">II. Nguyên tắc tính khối lượng</w:t>
       </w:r>
     </w:p>
     <w:p>
@@ -227,7 +467,7 @@
           <w:sz w:val="26"/>
           <w:szCs w:val="26"/>
         </w:rPr>
-        <w:t xml:space="preserve">II. Cách tính khối lượng và bao hàm đơn giá</w:t>
+        <w:t xml:space="preserve">III. Cách tính khối lượng và bao hàm đơn giá</w:t>
       </w:r>
     </w:p>
     <w:tbl>
@@ -3702,7 +3942,7 @@
           <w:sz w:val="26"/>
           <w:szCs w:val="26"/>
         </w:rPr>
-        <w:t xml:space="preserve">III. Không bao gồm trong đơn giá</w:t>
+        <w:t xml:space="preserve">IV. Không bao gồm trong phạm vi và đơn giá</w:t>
       </w:r>
     </w:p>
     <w:p>

</xml_diff>